<commit_message>
Formatos: los valores conservan la línea original y lo pendiente sale en amarillo
Las líneas ____ de los formatos ahora quedan como {campo|largo}: el valor va
subrayado y la línea continúa con guiones hasta cerca de su largo original.
Los campos vacíos, los espacios para fotos y planos, "Por definir" y la firma
salen resaltados en amarillo. Los campos que no aplican conservan la línea sin
resaltar.

Co-Authored-By: Claude Opus 5.5 <noreply@anthropic.com>
Claude-Session: https://claude.ai/code/session_01VUBGM1nJfcb5TeyK1LVFmV
</commit_message>
<xml_diff>
--- a/public/plantillas/F004.docx
+++ b/public/plantillas/F004.docx
@@ -131,7 +131,14 @@
           <w:rFonts w:ascii="Arial" w:cs="Arial" w:eastAsia="Arial" w:hAnsi="Arial"/>
           <w:rtl w:val="0"/>
         </w:rPr>
-        <w:t>{r1_natural}Persona</w:t>
+        <w:t>{r1_natural}</w:t>
+      </w:r>
+      <w:r>
+        <w:rPr>
+          <w:rFonts w:ascii="Arial" w:cs="Arial" w:eastAsia="Arial" w:hAnsi="Arial"/>
+          <w:rtl w:val="0"/>
+        </w:rPr>
+        <w:t>Persona</w:t>
       </w:r>
       <w:r>
         <w:rPr>
@@ -286,7 +293,7 @@
           <w:vertAlign w:val="baseline"/>
           <w:rtl w:val="0"/>
         </w:rPr>
-        <w:t>NIT</w:t>
+        <w:t xml:space="preserve">NIT</w:t>
       </w:r>
     </w:p>
     <w:p>
@@ -398,7 +405,7 @@
           <w:vertAlign w:val="baseline"/>
           <w:rtl w:val="0"/>
         </w:rPr>
-        <w:t>Pasaporte</w:t>
+        <w:t xml:space="preserve">Pasaporte</w:t>
       </w:r>
     </w:p>
     <w:p>
@@ -480,137 +487,185 @@
           <w:rFonts w:ascii="Arial" w:cs="Arial" w:eastAsia="Arial" w:hAnsi="Arial"/>
           <w:rtl w:val="0"/>
         </w:rPr>
-        <w:t>Número de documento: {r1_documento}</w:t>
-      </w:r>
-    </w:p>
-    <w:p>
-      <w:pPr>
-        <w:rPr>
-          <w:rFonts w:ascii="Arial" w:cs="Arial" w:eastAsia="Arial" w:hAnsi="Arial"/>
-        </w:rPr>
-      </w:pPr>
-      <w:r>
-        <w:rPr>
-          <w:rtl w:val="0"/>
-        </w:rPr>
-      </w:r>
-    </w:p>
-    <w:p>
-      <w:pPr>
-        <w:rPr>
-          <w:rFonts w:ascii="Arial" w:cs="Arial" w:eastAsia="Arial" w:hAnsi="Arial"/>
-        </w:rPr>
-      </w:pPr>
-      <w:r>
-        <w:rPr>
-          <w:rFonts w:ascii="Arial" w:cs="Arial" w:eastAsia="Arial" w:hAnsi="Arial"/>
-          <w:rtl w:val="0"/>
-        </w:rPr>
-        <w:t>Nombre completo: {r1_nombre}</w:t>
-      </w:r>
-    </w:p>
-    <w:p>
-      <w:pPr>
-        <w:rPr>
-          <w:rFonts w:ascii="Arial" w:cs="Arial" w:eastAsia="Arial" w:hAnsi="Arial"/>
-        </w:rPr>
-      </w:pPr>
-      <w:r>
-        <w:rPr>
-          <w:rtl w:val="0"/>
-        </w:rPr>
-      </w:r>
-    </w:p>
-    <w:p>
-      <w:pPr>
-        <w:rPr>
-          <w:rFonts w:ascii="Arial" w:cs="Arial" w:eastAsia="Arial" w:hAnsi="Arial"/>
-        </w:rPr>
-      </w:pPr>
-      <w:r>
-        <w:rPr>
-          <w:rFonts w:ascii="Arial" w:cs="Arial" w:eastAsia="Arial" w:hAnsi="Arial"/>
-          <w:rtl w:val="0"/>
-        </w:rPr>
-        <w:t>Empresa productora: {r1_empresa}</w:t>
-      </w:r>
-    </w:p>
-    <w:p>
-      <w:pPr>
-        <w:rPr>
-          <w:rFonts w:ascii="Arial" w:cs="Arial" w:eastAsia="Arial" w:hAnsi="Arial"/>
-        </w:rPr>
-      </w:pPr>
-      <w:r>
-        <w:rPr>
-          <w:rtl w:val="0"/>
-        </w:rPr>
-      </w:r>
-    </w:p>
-    <w:p>
-      <w:pPr>
-        <w:rPr>
-          <w:rFonts w:ascii="Arial" w:cs="Arial" w:eastAsia="Arial" w:hAnsi="Arial"/>
-        </w:rPr>
-      </w:pPr>
-      <w:r>
-        <w:rPr>
-          <w:rFonts w:ascii="Arial" w:cs="Arial" w:eastAsia="Arial" w:hAnsi="Arial"/>
-          <w:rtl w:val="0"/>
-        </w:rPr>
-        <w:t>Cargo dentro de la producción: {r1_cargo}</w:t>
-      </w:r>
-    </w:p>
-    <w:p>
-      <w:pPr>
-        <w:rPr>
-          <w:rFonts w:ascii="Arial" w:cs="Arial" w:eastAsia="Arial" w:hAnsi="Arial"/>
-        </w:rPr>
-      </w:pPr>
-      <w:r>
-        <w:rPr>
-          <w:rtl w:val="0"/>
-        </w:rPr>
-      </w:r>
-    </w:p>
-    <w:p>
-      <w:pPr>
-        <w:rPr>
-          <w:rFonts w:ascii="Arial" w:cs="Arial" w:eastAsia="Arial" w:hAnsi="Arial"/>
-        </w:rPr>
-      </w:pPr>
-      <w:r>
-        <w:rPr>
-          <w:rFonts w:ascii="Arial" w:cs="Arial" w:eastAsia="Arial" w:hAnsi="Arial"/>
-          <w:rtl w:val="0"/>
-        </w:rPr>
-        <w:t>Teléfono de contacto: {r1_telefono}</w:t>
-      </w:r>
-    </w:p>
-    <w:p>
-      <w:pPr>
-        <w:rPr>
-          <w:rFonts w:ascii="Arial" w:cs="Arial" w:eastAsia="Arial" w:hAnsi="Arial"/>
-        </w:rPr>
-      </w:pPr>
-      <w:r>
-        <w:rPr>
-          <w:rtl w:val="0"/>
-        </w:rPr>
-      </w:r>
-    </w:p>
-    <w:p>
-      <w:pPr>
-        <w:rPr>
-          <w:rFonts w:ascii="Arial" w:cs="Arial" w:eastAsia="Arial" w:hAnsi="Arial"/>
-        </w:rPr>
-      </w:pPr>
-      <w:r>
-        <w:rPr>
-          <w:rFonts w:ascii="Arial" w:cs="Arial" w:eastAsia="Arial" w:hAnsi="Arial"/>
-          <w:rtl w:val="0"/>
-        </w:rPr>
-        <w:t>Correo electrónico: {r1_correo}</w:t>
+        <w:t xml:space="preserve">Número de documento: </w:t>
+      </w:r>
+      <w:r>
+        <w:rPr>
+          <w:rFonts w:ascii="Arial" w:cs="Arial" w:eastAsia="Arial" w:hAnsi="Arial"/>
+          <w:u w:val="single"/>
+          <w:rtl w:val="0"/>
+        </w:rPr>
+        <w:t>{r1_documento|50}</w:t>
+      </w:r>
+    </w:p>
+    <w:p>
+      <w:pPr>
+        <w:rPr>
+          <w:rFonts w:ascii="Arial" w:cs="Arial" w:eastAsia="Arial" w:hAnsi="Arial"/>
+        </w:rPr>
+      </w:pPr>
+      <w:r>
+        <w:rPr>
+          <w:rtl w:val="0"/>
+        </w:rPr>
+      </w:r>
+    </w:p>
+    <w:p>
+      <w:pPr>
+        <w:rPr>
+          <w:rFonts w:ascii="Arial" w:cs="Arial" w:eastAsia="Arial" w:hAnsi="Arial"/>
+        </w:rPr>
+      </w:pPr>
+      <w:r>
+        <w:rPr>
+          <w:rFonts w:ascii="Arial" w:cs="Arial" w:eastAsia="Arial" w:hAnsi="Arial"/>
+          <w:rtl w:val="0"/>
+        </w:rPr>
+        <w:t xml:space="preserve">Nombre completo: </w:t>
+      </w:r>
+      <w:r>
+        <w:rPr>
+          <w:rFonts w:ascii="Arial" w:cs="Arial" w:eastAsia="Arial" w:hAnsi="Arial"/>
+          <w:u w:val="single"/>
+          <w:rtl w:val="0"/>
+        </w:rPr>
+        <w:t>{r1_nombre|55}</w:t>
+      </w:r>
+    </w:p>
+    <w:p>
+      <w:pPr>
+        <w:rPr>
+          <w:rFonts w:ascii="Arial" w:cs="Arial" w:eastAsia="Arial" w:hAnsi="Arial"/>
+        </w:rPr>
+      </w:pPr>
+      <w:r>
+        <w:rPr>
+          <w:rtl w:val="0"/>
+        </w:rPr>
+      </w:r>
+    </w:p>
+    <w:p>
+      <w:pPr>
+        <w:rPr>
+          <w:rFonts w:ascii="Arial" w:cs="Arial" w:eastAsia="Arial" w:hAnsi="Arial"/>
+        </w:rPr>
+      </w:pPr>
+      <w:r>
+        <w:rPr>
+          <w:rFonts w:ascii="Arial" w:cs="Arial" w:eastAsia="Arial" w:hAnsi="Arial"/>
+          <w:rtl w:val="0"/>
+        </w:rPr>
+        <w:t xml:space="preserve">Empresa productora: </w:t>
+      </w:r>
+      <w:r>
+        <w:rPr>
+          <w:rFonts w:ascii="Arial" w:cs="Arial" w:eastAsia="Arial" w:hAnsi="Arial"/>
+          <w:u w:val="single"/>
+          <w:rtl w:val="0"/>
+        </w:rPr>
+        <w:t>{r1_empresa|53}</w:t>
+      </w:r>
+    </w:p>
+    <w:p>
+      <w:pPr>
+        <w:rPr>
+          <w:rFonts w:ascii="Arial" w:cs="Arial" w:eastAsia="Arial" w:hAnsi="Arial"/>
+        </w:rPr>
+      </w:pPr>
+      <w:r>
+        <w:rPr>
+          <w:rtl w:val="0"/>
+        </w:rPr>
+      </w:r>
+    </w:p>
+    <w:p>
+      <w:pPr>
+        <w:rPr>
+          <w:rFonts w:ascii="Arial" w:cs="Arial" w:eastAsia="Arial" w:hAnsi="Arial"/>
+        </w:rPr>
+      </w:pPr>
+      <w:r>
+        <w:rPr>
+          <w:rFonts w:ascii="Arial" w:cs="Arial" w:eastAsia="Arial" w:hAnsi="Arial"/>
+          <w:rtl w:val="0"/>
+        </w:rPr>
+        <w:t xml:space="preserve">Cargo dentro de la producción: </w:t>
+      </w:r>
+      <w:r>
+        <w:rPr>
+          <w:rFonts w:ascii="Arial" w:cs="Arial" w:eastAsia="Arial" w:hAnsi="Arial"/>
+          <w:u w:val="single"/>
+          <w:rtl w:val="0"/>
+        </w:rPr>
+        <w:t>{r1_cargo|45}</w:t>
+      </w:r>
+    </w:p>
+    <w:p>
+      <w:pPr>
+        <w:rPr>
+          <w:rFonts w:ascii="Arial" w:cs="Arial" w:eastAsia="Arial" w:hAnsi="Arial"/>
+        </w:rPr>
+      </w:pPr>
+      <w:r>
+        <w:rPr>
+          <w:rtl w:val="0"/>
+        </w:rPr>
+      </w:r>
+    </w:p>
+    <w:p>
+      <w:pPr>
+        <w:rPr>
+          <w:rFonts w:ascii="Arial" w:cs="Arial" w:eastAsia="Arial" w:hAnsi="Arial"/>
+        </w:rPr>
+      </w:pPr>
+      <w:r>
+        <w:rPr>
+          <w:rFonts w:ascii="Arial" w:cs="Arial" w:eastAsia="Arial" w:hAnsi="Arial"/>
+          <w:rtl w:val="0"/>
+        </w:rPr>
+        <w:t xml:space="preserve">Teléfono de contacto: </w:t>
+      </w:r>
+      <w:r>
+        <w:rPr>
+          <w:rFonts w:ascii="Arial" w:cs="Arial" w:eastAsia="Arial" w:hAnsi="Arial"/>
+          <w:u w:val="single"/>
+          <w:rtl w:val="0"/>
+        </w:rPr>
+        <w:t>{r1_telefono|52}</w:t>
+      </w:r>
+    </w:p>
+    <w:p>
+      <w:pPr>
+        <w:rPr>
+          <w:rFonts w:ascii="Arial" w:cs="Arial" w:eastAsia="Arial" w:hAnsi="Arial"/>
+        </w:rPr>
+      </w:pPr>
+      <w:r>
+        <w:rPr>
+          <w:rtl w:val="0"/>
+        </w:rPr>
+      </w:r>
+    </w:p>
+    <w:p>
+      <w:pPr>
+        <w:rPr>
+          <w:rFonts w:ascii="Arial" w:cs="Arial" w:eastAsia="Arial" w:hAnsi="Arial"/>
+        </w:rPr>
+      </w:pPr>
+      <w:r>
+        <w:rPr>
+          <w:rFonts w:ascii="Arial" w:cs="Arial" w:eastAsia="Arial" w:hAnsi="Arial"/>
+          <w:rtl w:val="0"/>
+        </w:rPr>
+        <w:t xml:space="preserve">Correo electrónico: </w:t>
+      </w:r>
+      <w:r>
+        <w:rPr>
+          <w:rFonts w:ascii="Arial" w:cs="Arial" w:eastAsia="Arial" w:hAnsi="Arial"/>
+          <w:u w:val="single"/>
+          <w:rtl w:val="0"/>
+        </w:rPr>
+        <w:t>{r1_correo|54}</w:t>
       </w:r>
     </w:p>
     <w:p>
@@ -867,7 +922,7 @@
           <w:vertAlign w:val="baseline"/>
           <w:rtl w:val="0"/>
         </w:rPr>
-        <w:t>NIT</w:t>
+        <w:t xml:space="preserve">NIT</w:t>
       </w:r>
     </w:p>
     <w:p>
@@ -979,7 +1034,7 @@
           <w:vertAlign w:val="baseline"/>
           <w:rtl w:val="0"/>
         </w:rPr>
-        <w:t>Pasaporte</w:t>
+        <w:t xml:space="preserve">Pasaporte</w:t>
       </w:r>
     </w:p>
     <w:p>
@@ -1061,137 +1116,185 @@
           <w:rFonts w:ascii="Arial" w:cs="Arial" w:eastAsia="Arial" w:hAnsi="Arial"/>
           <w:rtl w:val="0"/>
         </w:rPr>
-        <w:t>Número de documento: {r2_documento}</w:t>
-      </w:r>
-    </w:p>
-    <w:p>
-      <w:pPr>
-        <w:rPr>
-          <w:rFonts w:ascii="Arial" w:cs="Arial" w:eastAsia="Arial" w:hAnsi="Arial"/>
-        </w:rPr>
-      </w:pPr>
-      <w:r>
-        <w:rPr>
-          <w:rtl w:val="0"/>
-        </w:rPr>
-      </w:r>
-    </w:p>
-    <w:p>
-      <w:pPr>
-        <w:rPr>
-          <w:rFonts w:ascii="Arial" w:cs="Arial" w:eastAsia="Arial" w:hAnsi="Arial"/>
-        </w:rPr>
-      </w:pPr>
-      <w:r>
-        <w:rPr>
-          <w:rFonts w:ascii="Arial" w:cs="Arial" w:eastAsia="Arial" w:hAnsi="Arial"/>
-          <w:rtl w:val="0"/>
-        </w:rPr>
-        <w:t>Nombre completo: {r2_nombre}</w:t>
-      </w:r>
-    </w:p>
-    <w:p>
-      <w:pPr>
-        <w:rPr>
-          <w:rFonts w:ascii="Arial" w:cs="Arial" w:eastAsia="Arial" w:hAnsi="Arial"/>
-        </w:rPr>
-      </w:pPr>
-      <w:r>
-        <w:rPr>
-          <w:rtl w:val="0"/>
-        </w:rPr>
-      </w:r>
-    </w:p>
-    <w:p>
-      <w:pPr>
-        <w:rPr>
-          <w:rFonts w:ascii="Arial" w:cs="Arial" w:eastAsia="Arial" w:hAnsi="Arial"/>
-        </w:rPr>
-      </w:pPr>
-      <w:r>
-        <w:rPr>
-          <w:rFonts w:ascii="Arial" w:cs="Arial" w:eastAsia="Arial" w:hAnsi="Arial"/>
-          <w:rtl w:val="0"/>
-        </w:rPr>
-        <w:t>Empresa productora: {r2_empresa}</w:t>
-      </w:r>
-    </w:p>
-    <w:p>
-      <w:pPr>
-        <w:rPr>
-          <w:rFonts w:ascii="Arial" w:cs="Arial" w:eastAsia="Arial" w:hAnsi="Arial"/>
-        </w:rPr>
-      </w:pPr>
-      <w:r>
-        <w:rPr>
-          <w:rtl w:val="0"/>
-        </w:rPr>
-      </w:r>
-    </w:p>
-    <w:p>
-      <w:pPr>
-        <w:rPr>
-          <w:rFonts w:ascii="Arial" w:cs="Arial" w:eastAsia="Arial" w:hAnsi="Arial"/>
-        </w:rPr>
-      </w:pPr>
-      <w:r>
-        <w:rPr>
-          <w:rFonts w:ascii="Arial" w:cs="Arial" w:eastAsia="Arial" w:hAnsi="Arial"/>
-          <w:rtl w:val="0"/>
-        </w:rPr>
-        <w:t>Cargo dentro de la producción: {r2_cargo}</w:t>
-      </w:r>
-    </w:p>
-    <w:p>
-      <w:pPr>
-        <w:rPr>
-          <w:rFonts w:ascii="Arial" w:cs="Arial" w:eastAsia="Arial" w:hAnsi="Arial"/>
-        </w:rPr>
-      </w:pPr>
-      <w:r>
-        <w:rPr>
-          <w:rtl w:val="0"/>
-        </w:rPr>
-      </w:r>
-    </w:p>
-    <w:p>
-      <w:pPr>
-        <w:rPr>
-          <w:rFonts w:ascii="Arial" w:cs="Arial" w:eastAsia="Arial" w:hAnsi="Arial"/>
-        </w:rPr>
-      </w:pPr>
-      <w:r>
-        <w:rPr>
-          <w:rFonts w:ascii="Arial" w:cs="Arial" w:eastAsia="Arial" w:hAnsi="Arial"/>
-          <w:rtl w:val="0"/>
-        </w:rPr>
-        <w:t>Teléfono de contacto: {r2_telefono}</w:t>
-      </w:r>
-    </w:p>
-    <w:p>
-      <w:pPr>
-        <w:rPr>
-          <w:rFonts w:ascii="Arial" w:cs="Arial" w:eastAsia="Arial" w:hAnsi="Arial"/>
-        </w:rPr>
-      </w:pPr>
-      <w:r>
-        <w:rPr>
-          <w:rtl w:val="0"/>
-        </w:rPr>
-      </w:r>
-    </w:p>
-    <w:p>
-      <w:pPr>
-        <w:rPr>
-          <w:rFonts w:ascii="Arial" w:cs="Arial" w:eastAsia="Arial" w:hAnsi="Arial"/>
-        </w:rPr>
-      </w:pPr>
-      <w:r>
-        <w:rPr>
-          <w:rFonts w:ascii="Arial" w:cs="Arial" w:eastAsia="Arial" w:hAnsi="Arial"/>
-          <w:rtl w:val="0"/>
-        </w:rPr>
-        <w:t>Correo electrónico: {r2_correo}</w:t>
+        <w:t xml:space="preserve">Número de documento: </w:t>
+      </w:r>
+      <w:r>
+        <w:rPr>
+          <w:rFonts w:ascii="Arial" w:cs="Arial" w:eastAsia="Arial" w:hAnsi="Arial"/>
+          <w:u w:val="single"/>
+          <w:rtl w:val="0"/>
+        </w:rPr>
+        <w:t>{r2_documento|50}</w:t>
+      </w:r>
+    </w:p>
+    <w:p>
+      <w:pPr>
+        <w:rPr>
+          <w:rFonts w:ascii="Arial" w:cs="Arial" w:eastAsia="Arial" w:hAnsi="Arial"/>
+        </w:rPr>
+      </w:pPr>
+      <w:r>
+        <w:rPr>
+          <w:rtl w:val="0"/>
+        </w:rPr>
+      </w:r>
+    </w:p>
+    <w:p>
+      <w:pPr>
+        <w:rPr>
+          <w:rFonts w:ascii="Arial" w:cs="Arial" w:eastAsia="Arial" w:hAnsi="Arial"/>
+        </w:rPr>
+      </w:pPr>
+      <w:r>
+        <w:rPr>
+          <w:rFonts w:ascii="Arial" w:cs="Arial" w:eastAsia="Arial" w:hAnsi="Arial"/>
+          <w:rtl w:val="0"/>
+        </w:rPr>
+        <w:t xml:space="preserve">Nombre completo: </w:t>
+      </w:r>
+      <w:r>
+        <w:rPr>
+          <w:rFonts w:ascii="Arial" w:cs="Arial" w:eastAsia="Arial" w:hAnsi="Arial"/>
+          <w:u w:val="single"/>
+          <w:rtl w:val="0"/>
+        </w:rPr>
+        <w:t>{r2_nombre|55}</w:t>
+      </w:r>
+    </w:p>
+    <w:p>
+      <w:pPr>
+        <w:rPr>
+          <w:rFonts w:ascii="Arial" w:cs="Arial" w:eastAsia="Arial" w:hAnsi="Arial"/>
+        </w:rPr>
+      </w:pPr>
+      <w:r>
+        <w:rPr>
+          <w:rtl w:val="0"/>
+        </w:rPr>
+      </w:r>
+    </w:p>
+    <w:p>
+      <w:pPr>
+        <w:rPr>
+          <w:rFonts w:ascii="Arial" w:cs="Arial" w:eastAsia="Arial" w:hAnsi="Arial"/>
+        </w:rPr>
+      </w:pPr>
+      <w:r>
+        <w:rPr>
+          <w:rFonts w:ascii="Arial" w:cs="Arial" w:eastAsia="Arial" w:hAnsi="Arial"/>
+          <w:rtl w:val="0"/>
+        </w:rPr>
+        <w:t xml:space="preserve">Empresa productora: </w:t>
+      </w:r>
+      <w:r>
+        <w:rPr>
+          <w:rFonts w:ascii="Arial" w:cs="Arial" w:eastAsia="Arial" w:hAnsi="Arial"/>
+          <w:u w:val="single"/>
+          <w:rtl w:val="0"/>
+        </w:rPr>
+        <w:t>{r2_empresa|53}</w:t>
+      </w:r>
+    </w:p>
+    <w:p>
+      <w:pPr>
+        <w:rPr>
+          <w:rFonts w:ascii="Arial" w:cs="Arial" w:eastAsia="Arial" w:hAnsi="Arial"/>
+        </w:rPr>
+      </w:pPr>
+      <w:r>
+        <w:rPr>
+          <w:rtl w:val="0"/>
+        </w:rPr>
+      </w:r>
+    </w:p>
+    <w:p>
+      <w:pPr>
+        <w:rPr>
+          <w:rFonts w:ascii="Arial" w:cs="Arial" w:eastAsia="Arial" w:hAnsi="Arial"/>
+        </w:rPr>
+      </w:pPr>
+      <w:r>
+        <w:rPr>
+          <w:rFonts w:ascii="Arial" w:cs="Arial" w:eastAsia="Arial" w:hAnsi="Arial"/>
+          <w:rtl w:val="0"/>
+        </w:rPr>
+        <w:t xml:space="preserve">Cargo dentro de la producción: </w:t>
+      </w:r>
+      <w:r>
+        <w:rPr>
+          <w:rFonts w:ascii="Arial" w:cs="Arial" w:eastAsia="Arial" w:hAnsi="Arial"/>
+          <w:u w:val="single"/>
+          <w:rtl w:val="0"/>
+        </w:rPr>
+        <w:t>{r2_cargo|45}</w:t>
+      </w:r>
+    </w:p>
+    <w:p>
+      <w:pPr>
+        <w:rPr>
+          <w:rFonts w:ascii="Arial" w:cs="Arial" w:eastAsia="Arial" w:hAnsi="Arial"/>
+        </w:rPr>
+      </w:pPr>
+      <w:r>
+        <w:rPr>
+          <w:rtl w:val="0"/>
+        </w:rPr>
+      </w:r>
+    </w:p>
+    <w:p>
+      <w:pPr>
+        <w:rPr>
+          <w:rFonts w:ascii="Arial" w:cs="Arial" w:eastAsia="Arial" w:hAnsi="Arial"/>
+        </w:rPr>
+      </w:pPr>
+      <w:r>
+        <w:rPr>
+          <w:rFonts w:ascii="Arial" w:cs="Arial" w:eastAsia="Arial" w:hAnsi="Arial"/>
+          <w:rtl w:val="0"/>
+        </w:rPr>
+        <w:t xml:space="preserve">Teléfono de contacto: </w:t>
+      </w:r>
+      <w:r>
+        <w:rPr>
+          <w:rFonts w:ascii="Arial" w:cs="Arial" w:eastAsia="Arial" w:hAnsi="Arial"/>
+          <w:u w:val="single"/>
+          <w:rtl w:val="0"/>
+        </w:rPr>
+        <w:t>{r2_telefono|52}</w:t>
+      </w:r>
+    </w:p>
+    <w:p>
+      <w:pPr>
+        <w:rPr>
+          <w:rFonts w:ascii="Arial" w:cs="Arial" w:eastAsia="Arial" w:hAnsi="Arial"/>
+        </w:rPr>
+      </w:pPr>
+      <w:r>
+        <w:rPr>
+          <w:rtl w:val="0"/>
+        </w:rPr>
+      </w:r>
+    </w:p>
+    <w:p>
+      <w:pPr>
+        <w:rPr>
+          <w:rFonts w:ascii="Arial" w:cs="Arial" w:eastAsia="Arial" w:hAnsi="Arial"/>
+        </w:rPr>
+      </w:pPr>
+      <w:r>
+        <w:rPr>
+          <w:rFonts w:ascii="Arial" w:cs="Arial" w:eastAsia="Arial" w:hAnsi="Arial"/>
+          <w:rtl w:val="0"/>
+        </w:rPr>
+        <w:t xml:space="preserve">Correo electrónico: </w:t>
+      </w:r>
+      <w:r>
+        <w:rPr>
+          <w:rFonts w:ascii="Arial" w:cs="Arial" w:eastAsia="Arial" w:hAnsi="Arial"/>
+          <w:u w:val="single"/>
+          <w:rtl w:val="0"/>
+        </w:rPr>
+        <w:t>{r2_correo|54}</w:t>
       </w:r>
     </w:p>
     <w:p>
@@ -1407,7 +1510,7 @@
           <w:vertAlign w:val="baseline"/>
           <w:rtl w:val="0"/>
         </w:rPr>
-        <w:t>Cine</w:t>
+        <w:t xml:space="preserve">Cine</w:t>
       </w:r>
     </w:p>
     <w:p>
@@ -1463,7 +1566,7 @@
           <w:vertAlign w:val="baseline"/>
           <w:rtl w:val="0"/>
         </w:rPr>
-        <w:t>Televisión</w:t>
+        <w:t xml:space="preserve">Televisión</w:t>
       </w:r>
     </w:p>
     <w:p>
@@ -1519,7 +1622,7 @@
           <w:vertAlign w:val="baseline"/>
           <w:rtl w:val="0"/>
         </w:rPr>
-        <w:t>Publicidad</w:t>
+        <w:t xml:space="preserve">Publicidad</w:t>
       </w:r>
     </w:p>
     <w:p>
@@ -1575,7 +1678,7 @@
           <w:vertAlign w:val="baseline"/>
           <w:rtl w:val="0"/>
         </w:rPr>
-        <w:t>Contenidos web</w:t>
+        <w:t xml:space="preserve">Contenidos web</w:t>
       </w:r>
     </w:p>
     <w:p>
@@ -1631,7 +1734,7 @@
           <w:vertAlign w:val="baseline"/>
           <w:rtl w:val="0"/>
         </w:rPr>
-        <w:t>Videos musicales / videoclips</w:t>
+        <w:t xml:space="preserve">Videos musicales / videoclips</w:t>
       </w:r>
     </w:p>
     <w:p>
@@ -2202,7 +2305,7 @@
           <w:vertAlign w:val="baseline"/>
           <w:rtl w:val="0"/>
         </w:rPr>
-        <w:t>Serie</w:t>
+        <w:t xml:space="preserve">Serie</w:t>
       </w:r>
     </w:p>
     <w:p>
@@ -2258,7 +2361,7 @@
           <w:vertAlign w:val="baseline"/>
           <w:rtl w:val="0"/>
         </w:rPr>
-        <w:t>Telenovela</w:t>
+        <w:t xml:space="preserve">Telenovela</w:t>
       </w:r>
     </w:p>
     <w:p>
@@ -2314,7 +2417,7 @@
           <w:vertAlign w:val="baseline"/>
           <w:rtl w:val="0"/>
         </w:rPr>
-        <w:t>Reality</w:t>
+        <w:t xml:space="preserve">Reality</w:t>
       </w:r>
     </w:p>
     <w:p>
@@ -2370,7 +2473,41 @@
           <w:vertAlign w:val="baseline"/>
           <w:rtl w:val="0"/>
         </w:rPr>
-        <w:t xml:space="preserve">Otro ¿cuál? {tv_otro_cual} </w:t>
+        <w:t xml:space="preserve">Otro ¿cuál? </w:t>
+      </w:r>
+      <w:r>
+        <w:rPr>
+          <w:rFonts w:ascii="Arial" w:cs="Arial" w:eastAsia="Arial" w:hAnsi="Arial"/>
+          <w:b w:val="0"/>
+          <w:i w:val="0"/>
+          <w:smallCaps w:val="0"/>
+          <w:strike w:val="0"/>
+          <w:color w:val="000000"/>
+          <w:sz w:val="24"/>
+          <w:szCs w:val="24"/>
+          <w:u w:val="single"/>
+          <w:shd w:fill="auto" w:val="clear"/>
+          <w:vertAlign w:val="baseline"/>
+          <w:rtl w:val="0"/>
+        </w:rPr>
+        <w:t>{tv_otro_cual|15}</w:t>
+      </w:r>
+      <w:r>
+        <w:rPr>
+          <w:rFonts w:ascii="Arial" w:cs="Arial" w:eastAsia="Arial" w:hAnsi="Arial"/>
+          <w:b w:val="0"/>
+          <w:i w:val="0"/>
+          <w:smallCaps w:val="0"/>
+          <w:strike w:val="0"/>
+          <w:color w:val="000000"/>
+          <w:sz w:val="24"/>
+          <w:szCs w:val="24"/>
+          <w:u w:val="none"/>
+          <w:shd w:fill="auto" w:val="clear"/>
+          <w:vertAlign w:val="baseline"/>
+          <w:rtl w:val="0"/>
+        </w:rPr>
+        <w:t xml:space="preserve"> </w:t>
       </w:r>
     </w:p>
     <w:p>
@@ -2576,7 +2713,24 @@
           <w:vertAlign w:val="baseline"/>
           <w:rtl w:val="0"/>
         </w:rPr>
-        <w:t>Nombre del producto o campaña: {pub_campana}</w:t>
+        <w:t xml:space="preserve">Nombre del producto o campaña: </w:t>
+      </w:r>
+      <w:r>
+        <w:rPr>
+          <w:rFonts w:ascii="Arial" w:cs="Arial" w:eastAsia="Arial" w:hAnsi="Arial"/>
+          <w:b w:val="0"/>
+          <w:i w:val="0"/>
+          <w:smallCaps w:val="0"/>
+          <w:strike w:val="0"/>
+          <w:color w:val="000000"/>
+          <w:sz w:val="24"/>
+          <w:szCs w:val="24"/>
+          <w:u w:val="single"/>
+          <w:shd w:fill="auto" w:val="clear"/>
+          <w:vertAlign w:val="baseline"/>
+          <w:rtl w:val="0"/>
+        </w:rPr>
+        <w:t>{pub_campana|37}</w:t>
       </w:r>
     </w:p>
     <w:p>
@@ -2755,7 +2909,7 @@
           <w:vertAlign w:val="baseline"/>
           <w:rtl w:val="0"/>
         </w:rPr>
-        <w:t>Spot publicitario</w:t>
+        <w:t xml:space="preserve">Spot publicitario</w:t>
       </w:r>
     </w:p>
     <w:p>
@@ -2811,7 +2965,7 @@
           <w:vertAlign w:val="baseline"/>
           <w:rtl w:val="0"/>
         </w:rPr>
-        <w:t>Vídeo corporativo</w:t>
+        <w:t xml:space="preserve">Vídeo corporativo</w:t>
       </w:r>
     </w:p>
     <w:p>
@@ -2867,7 +3021,7 @@
           <w:vertAlign w:val="baseline"/>
           <w:rtl w:val="0"/>
         </w:rPr>
-        <w:t>Vídeo promocional</w:t>
+        <w:t xml:space="preserve">Vídeo promocional</w:t>
       </w:r>
     </w:p>
     <w:p>
@@ -2923,7 +3077,7 @@
           <w:vertAlign w:val="baseline"/>
           <w:rtl w:val="0"/>
         </w:rPr>
-        <w:t>Producción para redes</w:t>
+        <w:t xml:space="preserve">Producción para redes</w:t>
       </w:r>
     </w:p>
     <w:p>
@@ -2979,7 +3133,24 @@
           <w:vertAlign w:val="baseline"/>
           <w:rtl w:val="0"/>
         </w:rPr>
-        <w:t>Otro ¿cuál? {pub_otro_cual}</w:t>
+        <w:t xml:space="preserve">Otro ¿cuál? </w:t>
+      </w:r>
+      <w:r>
+        <w:rPr>
+          <w:rFonts w:ascii="Arial" w:cs="Arial" w:eastAsia="Arial" w:hAnsi="Arial"/>
+          <w:b w:val="0"/>
+          <w:i w:val="0"/>
+          <w:smallCaps w:val="0"/>
+          <w:strike w:val="0"/>
+          <w:color w:val="000000"/>
+          <w:sz w:val="24"/>
+          <w:szCs w:val="24"/>
+          <w:u w:val="single"/>
+          <w:shd w:fill="auto" w:val="clear"/>
+          <w:vertAlign w:val="baseline"/>
+          <w:rtl w:val="0"/>
+        </w:rPr>
+        <w:t>{pub_otro_cual|19}</w:t>
       </w:r>
     </w:p>
     <w:p>
@@ -3185,7 +3356,24 @@
           <w:vertAlign w:val="baseline"/>
           <w:rtl w:val="0"/>
         </w:rPr>
-        <w:t>Nombre del artista o agrupación musical: {vc_artista}</w:t>
+        <w:t xml:space="preserve">Nombre del artista o agrupación musical: </w:t>
+      </w:r>
+      <w:r>
+        <w:rPr>
+          <w:rFonts w:ascii="Arial" w:cs="Arial" w:eastAsia="Arial" w:hAnsi="Arial"/>
+          <w:b w:val="0"/>
+          <w:i w:val="0"/>
+          <w:smallCaps w:val="0"/>
+          <w:strike w:val="0"/>
+          <w:color w:val="000000"/>
+          <w:sz w:val="24"/>
+          <w:szCs w:val="24"/>
+          <w:u w:val="single"/>
+          <w:shd w:fill="auto" w:val="clear"/>
+          <w:vertAlign w:val="baseline"/>
+          <w:rtl w:val="0"/>
+        </w:rPr>
+        <w:t>{vc_artista|31}</w:t>
       </w:r>
     </w:p>
     <w:p>
@@ -3271,7 +3459,24 @@
           <w:vertAlign w:val="baseline"/>
           <w:rtl w:val="0"/>
         </w:rPr>
-        <w:t>Nombre de la canción:  {vc_cancion}</w:t>
+        <w:t xml:space="preserve">Nombre de la canción:  </w:t>
+      </w:r>
+      <w:r>
+        <w:rPr>
+          <w:rFonts w:ascii="Arial" w:cs="Arial" w:eastAsia="Arial" w:hAnsi="Arial"/>
+          <w:b w:val="0"/>
+          <w:i w:val="0"/>
+          <w:smallCaps w:val="0"/>
+          <w:strike w:val="0"/>
+          <w:color w:val="000000"/>
+          <w:sz w:val="24"/>
+          <w:szCs w:val="24"/>
+          <w:u w:val="single"/>
+          <w:shd w:fill="auto" w:val="clear"/>
+          <w:vertAlign w:val="baseline"/>
+          <w:rtl w:val="0"/>
+        </w:rPr>
+        <w:t>{vc_cancion|45}</w:t>
       </w:r>
     </w:p>
     <w:p>
@@ -3355,7 +3560,15 @@
           <w:rFonts w:ascii="Arial" w:cs="Arial" w:eastAsia="Arial" w:hAnsi="Arial"/>
           <w:rtl w:val="0"/>
         </w:rPr>
-        <w:t>El tipo de contenido audiovisual: {web_tipo}</w:t>
+        <w:t xml:space="preserve">El tipo de contenido audiovisual: </w:t>
+      </w:r>
+      <w:r>
+        <w:rPr>
+          <w:rFonts w:ascii="Arial" w:cs="Arial" w:eastAsia="Arial" w:hAnsi="Arial"/>
+          <w:u w:val="single"/>
+          <w:rtl w:val="0"/>
+        </w:rPr>
+        <w:t>{web_tipo|36}</w:t>
       </w:r>
     </w:p>
     <w:p>
@@ -3386,7 +3599,15 @@
           <w:rFonts w:ascii="Arial" w:cs="Arial" w:eastAsia="Arial" w:hAnsi="Arial"/>
           <w:rtl w:val="0"/>
         </w:rPr>
-        <w:t>Nombre del contenido:  {web_nombre}</w:t>
+        <w:t xml:space="preserve">Nombre del contenido:  </w:t>
+      </w:r>
+      <w:r>
+        <w:rPr>
+          <w:rFonts w:ascii="Arial" w:cs="Arial" w:eastAsia="Arial" w:hAnsi="Arial"/>
+          <w:u w:val="single"/>
+          <w:rtl w:val="0"/>
+        </w:rPr>
+        <w:t>{web_nombre|43}</w:t>
       </w:r>
     </w:p>
     <w:p>
@@ -3485,7 +3706,7 @@
           <w:vertAlign w:val="baseline"/>
           <w:rtl w:val="0"/>
         </w:rPr>
-        <w:t>Nacional</w:t>
+        <w:t xml:space="preserve">Nacional</w:t>
       </w:r>
       <w:r>
         <w:rPr>
@@ -3546,7 +3767,7 @@
           <w:vertAlign w:val="baseline"/>
           <w:rtl w:val="0"/>
         </w:rPr>
-        <w:t>Internacional</w:t>
+        <w:t xml:space="preserve">Internacional</w:t>
       </w:r>
       <w:r>
         <w:rPr>
@@ -3607,38 +3828,52 @@
           <w:vertAlign w:val="baseline"/>
           <w:rtl w:val="0"/>
         </w:rPr>
-        <w:t>Servicios de producción para producto internacional</w:t>
-      </w:r>
-      <w:r>
-        <w:rPr>
-          <w:rtl w:val="0"/>
-        </w:rPr>
-      </w:r>
-    </w:p>
-    <w:p>
-      <w:pPr>
-        <w:rPr>
-          <w:rFonts w:ascii="Arial" w:cs="Arial" w:eastAsia="Arial" w:hAnsi="Arial"/>
-        </w:rPr>
-      </w:pPr>
-      <w:r>
-        <w:rPr>
-          <w:rtl w:val="0"/>
-        </w:rPr>
-      </w:r>
-    </w:p>
-    <w:p>
-      <w:pPr>
-        <w:rPr>
-          <w:rFonts w:ascii="Arial" w:cs="Arial" w:eastAsia="Arial" w:hAnsi="Arial"/>
-        </w:rPr>
-      </w:pPr>
-      <w:r>
-        <w:rPr>
-          <w:rFonts w:ascii="Arial" w:cs="Arial" w:eastAsia="Arial" w:hAnsi="Arial"/>
-          <w:rtl w:val="0"/>
-        </w:rPr>
-        <w:t>Nombre del proyecto:  {proyecto_nombre}</w:t>
+        <w:t xml:space="preserve">Servicios de producción para producto internacional</w:t>
+      </w:r>
+      <w:r>
+        <w:rPr>
+          <w:rtl w:val="0"/>
+        </w:rPr>
+      </w:r>
+    </w:p>
+    <w:p>
+      <w:pPr>
+        <w:rPr>
+          <w:rFonts w:ascii="Arial" w:cs="Arial" w:eastAsia="Arial" w:hAnsi="Arial"/>
+        </w:rPr>
+      </w:pPr>
+      <w:r>
+        <w:rPr>
+          <w:rtl w:val="0"/>
+        </w:rPr>
+      </w:r>
+    </w:p>
+    <w:p>
+      <w:pPr>
+        <w:rPr>
+          <w:rFonts w:ascii="Arial" w:cs="Arial" w:eastAsia="Arial" w:hAnsi="Arial"/>
+        </w:rPr>
+      </w:pPr>
+      <w:r>
+        <w:rPr>
+          <w:rFonts w:ascii="Arial" w:cs="Arial" w:eastAsia="Arial" w:hAnsi="Arial"/>
+          <w:rtl w:val="0"/>
+        </w:rPr>
+        <w:t xml:space="preserve">Nombre del proyecto:  </w:t>
+      </w:r>
+      <w:r>
+        <w:rPr>
+          <w:rFonts w:ascii="Arial" w:cs="Arial" w:eastAsia="Arial" w:hAnsi="Arial"/>
+          <w:u w:val="single"/>
+          <w:rtl w:val="0"/>
+        </w:rPr>
+        <w:t>{proyecto_nombre|46}</w:t>
+      </w:r>
+      <w:r>
+        <w:rPr>
+          <w:rFonts w:ascii="Arial" w:cs="Arial" w:eastAsia="Arial" w:hAnsi="Arial"/>
+          <w:rtl w:val="0"/>
+        </w:rPr>
         <w:br/>
       </w:r>
     </w:p>
@@ -3928,7 +4163,15 @@
           <w:rFonts w:ascii="Arial" w:cs="Arial" w:eastAsia="Arial" w:hAnsi="Arial"/>
           <w:rtl w:val="0"/>
         </w:rPr>
-        <w:t>El nombre de la institución educativa a la que pertenece: {ex_institucion}</w:t>
+        <w:t xml:space="preserve">El nombre de la institución educativa a la que pertenece: </w:t>
+      </w:r>
+      <w:r>
+        <w:rPr>
+          <w:rFonts w:ascii="Arial" w:cs="Arial" w:eastAsia="Arial" w:hAnsi="Arial"/>
+          <w:u w:val="single"/>
+          <w:rtl w:val="0"/>
+        </w:rPr>
+        <w:t>{ex_institucion|24}</w:t>
       </w:r>
     </w:p>
     <w:p>
@@ -4054,7 +4297,15 @@
           <w:rFonts w:ascii="Arial" w:cs="Arial" w:eastAsia="Arial" w:hAnsi="Arial"/>
           <w:rtl w:val="0"/>
         </w:rPr>
-        <w:t>El nombre del colectivo al que pertenece: {ex_colectivo}</w:t>
+        <w:t xml:space="preserve">El nombre del colectivo al que pertenece: </w:t>
+      </w:r>
+      <w:r>
+        <w:rPr>
+          <w:rFonts w:ascii="Arial" w:cs="Arial" w:eastAsia="Arial" w:hAnsi="Arial"/>
+          <w:u w:val="single"/>
+          <w:rtl w:val="0"/>
+        </w:rPr>
+        <w:t>{ex_colectivo|36}</w:t>
       </w:r>
     </w:p>
     <w:p>
@@ -4179,7 +4430,15 @@
           <w:rFonts w:ascii="Arial" w:cs="Arial" w:eastAsia="Arial" w:hAnsi="Arial"/>
           <w:rtl w:val="0"/>
         </w:rPr>
-        <w:t>De qué convocatoria o fondo fue beneficiario: {ex_fondo}</w:t>
+        <w:t xml:space="preserve">De qué convocatoria o fondo fue beneficiario: </w:t>
+      </w:r>
+      <w:r>
+        <w:rPr>
+          <w:rFonts w:ascii="Arial" w:cs="Arial" w:eastAsia="Arial" w:hAnsi="Arial"/>
+          <w:u w:val="single"/>
+          <w:rtl w:val="0"/>
+        </w:rPr>
+        <w:t>{ex_fondo|33}</w:t>
       </w:r>
     </w:p>
     <w:p>
@@ -4300,7 +4559,15 @@
           <w:rFonts w:ascii="Arial" w:cs="Arial" w:eastAsia="Arial" w:hAnsi="Arial"/>
           <w:rtl w:val="0"/>
         </w:rPr>
-        <w:t>Número de personas que intervienen entre equipo técnico, reparto principal y secundario, y proveedores de producción o servicios conexos:  {personas_equipo}</w:t>
+        <w:t xml:space="preserve">Número de personas que intervienen entre equipo técnico, reparto principal y secundario, y proveedores de producción o servicios conexos:  </w:t>
+      </w:r>
+      <w:r>
+        <w:rPr>
+          <w:rFonts w:ascii="Arial" w:cs="Arial" w:eastAsia="Arial" w:hAnsi="Arial"/>
+          <w:u w:val="single"/>
+          <w:rtl w:val="0"/>
+        </w:rPr>
+        <w:t>{personas_equipo|6}</w:t>
       </w:r>
     </w:p>
     <w:p>
@@ -4328,7 +4595,22 @@
           <w:rFonts w:ascii="Arial" w:cs="Arial" w:eastAsia="Arial" w:hAnsi="Arial"/>
           <w:rtl w:val="0"/>
         </w:rPr>
-        <w:t xml:space="preserve">Número de extras y figurantes coordinados: {personas_extras} </w:t>
+        <w:t xml:space="preserve">Número de extras y figurantes coordinados: </w:t>
+      </w:r>
+      <w:r>
+        <w:rPr>
+          <w:rFonts w:ascii="Arial" w:cs="Arial" w:eastAsia="Arial" w:hAnsi="Arial"/>
+          <w:u w:val="single"/>
+          <w:rtl w:val="0"/>
+        </w:rPr>
+        <w:t>{personas_extras|8}</w:t>
+      </w:r>
+      <w:r>
+        <w:rPr>
+          <w:rFonts w:ascii="Arial" w:cs="Arial" w:eastAsia="Arial" w:hAnsi="Arial"/>
+          <w:rtl w:val="0"/>
+        </w:rPr>
+        <w:t xml:space="preserve"> </w:t>
       </w:r>
     </w:p>
     <w:p>
@@ -4356,7 +4638,15 @@
           <w:rFonts w:ascii="Arial" w:cs="Arial" w:eastAsia="Arial" w:hAnsi="Arial"/>
           <w:rtl w:val="0"/>
         </w:rPr>
-        <w:t>Si la filmación va a generar una aglomeración, indique el número de personas convocadas. Este número no contempla las personas del equipo técnico, reparto principal y secundario, proveedores de producción, extras y/o figurantes: {personas_aglomeracion}</w:t>
+        <w:t xml:space="preserve">Si la filmación va a generar una aglomeración, indique el número de personas convocadas. Este número no contempla las personas del equipo técnico, reparto principal y secundario, proveedores de producción, extras y/o figurantes: </w:t>
+      </w:r>
+      <w:r>
+        <w:rPr>
+          <w:rFonts w:ascii="Arial" w:cs="Arial" w:eastAsia="Arial" w:hAnsi="Arial"/>
+          <w:u w:val="single"/>
+          <w:rtl w:val="0"/>
+        </w:rPr>
+        <w:t>{personas_aglomeracion|8}</w:t>
       </w:r>
     </w:p>
     <w:p>
@@ -4566,7 +4856,7 @@
           <w:vertAlign w:val="baseline"/>
           <w:rtl w:val="0"/>
         </w:rPr>
-        <w:t>Efectos de fuego</w:t>
+        <w:t xml:space="preserve">Efectos de fuego</w:t>
       </w:r>
     </w:p>
     <w:p>
@@ -4622,7 +4912,7 @@
           <w:vertAlign w:val="baseline"/>
           <w:rtl w:val="0"/>
         </w:rPr>
-        <w:t>Efectos climáticos con agua (efecto lluvia)</w:t>
+        <w:t xml:space="preserve">Efectos climáticos con agua (efecto lluvia)</w:t>
       </w:r>
     </w:p>
     <w:p>
@@ -4678,7 +4968,7 @@
           <w:vertAlign w:val="baseline"/>
           <w:rtl w:val="0"/>
         </w:rPr>
-        <w:t>Efectos climáticos lumínicos</w:t>
+        <w:t xml:space="preserve">Efectos climáticos lumínicos</w:t>
       </w:r>
     </w:p>
     <w:p>
@@ -4734,7 +5024,7 @@
           <w:vertAlign w:val="baseline"/>
           <w:rtl w:val="0"/>
         </w:rPr>
-        <w:t>Cargas dirigidas a superficies o cuerpos (disparos)</w:t>
+        <w:t xml:space="preserve">Cargas dirigidas a superficies o cuerpos (disparos)</w:t>
       </w:r>
     </w:p>
     <w:p>
@@ -4790,7 +5080,7 @@
           <w:vertAlign w:val="baseline"/>
           <w:rtl w:val="0"/>
         </w:rPr>
-        <w:t>Aire comprimido</w:t>
+        <w:t xml:space="preserve">Aire comprimido</w:t>
       </w:r>
     </w:p>
     <w:p>
@@ -4846,7 +5136,7 @@
           <w:vertAlign w:val="baseline"/>
           <w:rtl w:val="0"/>
         </w:rPr>
-        <w:t>Explosiones</w:t>
+        <w:t xml:space="preserve">Explosiones</w:t>
       </w:r>
     </w:p>
     <w:p>
@@ -4916,7 +5206,15 @@
           <w:rFonts w:ascii="Arial" w:cs="Arial" w:eastAsia="Arial" w:hAnsi="Arial"/>
           <w:rtl w:val="0"/>
         </w:rPr>
-        <w:t>¿cuál? {fx_otro_cual}</w:t>
+        <w:t xml:space="preserve">¿cuál? </w:t>
+      </w:r>
+      <w:r>
+        <w:rPr>
+          <w:rFonts w:ascii="Arial" w:cs="Arial" w:eastAsia="Arial" w:hAnsi="Arial"/>
+          <w:u w:val="single"/>
+          <w:rtl w:val="0"/>
+        </w:rPr>
+        <w:t>{fx_otro_cual|56}</w:t>
       </w:r>
     </w:p>
     <w:p>
@@ -5111,33 +5409,49 @@
           <w:rFonts w:ascii="Arial" w:cs="Arial" w:eastAsia="Arial" w:hAnsi="Arial"/>
           <w:rtl w:val="0"/>
         </w:rPr>
-        <w:t>Tipo o raza del animal: {an_tipo}</w:t>
-      </w:r>
-    </w:p>
-    <w:p>
-      <w:pPr>
-        <w:rPr>
-          <w:rFonts w:ascii="Arial" w:cs="Arial" w:eastAsia="Arial" w:hAnsi="Arial"/>
-        </w:rPr>
-      </w:pPr>
-      <w:r>
-        <w:rPr>
-          <w:rtl w:val="0"/>
-        </w:rPr>
-      </w:r>
-    </w:p>
-    <w:p>
-      <w:pPr>
-        <w:rPr>
-          <w:rFonts w:ascii="Arial" w:cs="Arial" w:eastAsia="Arial" w:hAnsi="Arial"/>
-        </w:rPr>
-      </w:pPr>
-      <w:r>
-        <w:rPr>
-          <w:rFonts w:ascii="Arial" w:cs="Arial" w:eastAsia="Arial" w:hAnsi="Arial"/>
-          <w:rtl w:val="0"/>
-        </w:rPr>
-        <w:t>Cantidad de animales en escena: {an_cantidad}</w:t>
+        <w:t xml:space="preserve">Tipo o raza del animal: </w:t>
+      </w:r>
+      <w:r>
+        <w:rPr>
+          <w:rFonts w:ascii="Arial" w:cs="Arial" w:eastAsia="Arial" w:hAnsi="Arial"/>
+          <w:u w:val="single"/>
+          <w:rtl w:val="0"/>
+        </w:rPr>
+        <w:t>{an_tipo|51}</w:t>
+      </w:r>
+    </w:p>
+    <w:p>
+      <w:pPr>
+        <w:rPr>
+          <w:rFonts w:ascii="Arial" w:cs="Arial" w:eastAsia="Arial" w:hAnsi="Arial"/>
+        </w:rPr>
+      </w:pPr>
+      <w:r>
+        <w:rPr>
+          <w:rtl w:val="0"/>
+        </w:rPr>
+      </w:r>
+    </w:p>
+    <w:p>
+      <w:pPr>
+        <w:rPr>
+          <w:rFonts w:ascii="Arial" w:cs="Arial" w:eastAsia="Arial" w:hAnsi="Arial"/>
+        </w:rPr>
+      </w:pPr>
+      <w:r>
+        <w:rPr>
+          <w:rFonts w:ascii="Arial" w:cs="Arial" w:eastAsia="Arial" w:hAnsi="Arial"/>
+          <w:rtl w:val="0"/>
+        </w:rPr>
+        <w:t xml:space="preserve">Cantidad de animales en escena: </w:t>
+      </w:r>
+      <w:r>
+        <w:rPr>
+          <w:rFonts w:ascii="Arial" w:cs="Arial" w:eastAsia="Arial" w:hAnsi="Arial"/>
+          <w:u w:val="single"/>
+          <w:rtl w:val="0"/>
+        </w:rPr>
+        <w:t>{an_cantidad|43}</w:t>
       </w:r>
     </w:p>
     <w:p>
@@ -5478,33 +5792,49 @@
           <w:rFonts w:ascii="Arial" w:cs="Arial" w:eastAsia="Arial" w:hAnsi="Arial"/>
           <w:rtl w:val="0"/>
         </w:rPr>
-        <w:t>Tipos de armas en escena: {ar_tipos}</w:t>
-      </w:r>
-    </w:p>
-    <w:p>
-      <w:pPr>
-        <w:rPr>
-          <w:rFonts w:ascii="Arial" w:cs="Arial" w:eastAsia="Arial" w:hAnsi="Arial"/>
-        </w:rPr>
-      </w:pPr>
-      <w:r>
-        <w:rPr>
-          <w:rtl w:val="0"/>
-        </w:rPr>
-      </w:r>
-    </w:p>
-    <w:p>
-      <w:pPr>
-        <w:rPr>
-          <w:rFonts w:ascii="Arial" w:cs="Arial" w:eastAsia="Arial" w:hAnsi="Arial"/>
-        </w:rPr>
-      </w:pPr>
-      <w:r>
-        <w:rPr>
-          <w:rFonts w:ascii="Arial" w:cs="Arial" w:eastAsia="Arial" w:hAnsi="Arial"/>
-          <w:rtl w:val="0"/>
-        </w:rPr>
-        <w:t>Cantidad de armas en escena: {ar_cantidad}</w:t>
+        <w:t xml:space="preserve">Tipos de armas en escena: </w:t>
+      </w:r>
+      <w:r>
+        <w:rPr>
+          <w:rFonts w:ascii="Arial" w:cs="Arial" w:eastAsia="Arial" w:hAnsi="Arial"/>
+          <w:u w:val="single"/>
+          <w:rtl w:val="0"/>
+        </w:rPr>
+        <w:t>{ar_tipos|48}</w:t>
+      </w:r>
+    </w:p>
+    <w:p>
+      <w:pPr>
+        <w:rPr>
+          <w:rFonts w:ascii="Arial" w:cs="Arial" w:eastAsia="Arial" w:hAnsi="Arial"/>
+        </w:rPr>
+      </w:pPr>
+      <w:r>
+        <w:rPr>
+          <w:rtl w:val="0"/>
+        </w:rPr>
+      </w:r>
+    </w:p>
+    <w:p>
+      <w:pPr>
+        <w:rPr>
+          <w:rFonts w:ascii="Arial" w:cs="Arial" w:eastAsia="Arial" w:hAnsi="Arial"/>
+        </w:rPr>
+      </w:pPr>
+      <w:r>
+        <w:rPr>
+          <w:rFonts w:ascii="Arial" w:cs="Arial" w:eastAsia="Arial" w:hAnsi="Arial"/>
+          <w:rtl w:val="0"/>
+        </w:rPr>
+        <w:t xml:space="preserve">Cantidad de armas en escena: </w:t>
+      </w:r>
+      <w:r>
+        <w:rPr>
+          <w:rFonts w:ascii="Arial" w:cs="Arial" w:eastAsia="Arial" w:hAnsi="Arial"/>
+          <w:u w:val="single"/>
+          <w:rtl w:val="0"/>
+        </w:rPr>
+        <w:t>{ar_cantidad|45}</w:t>
       </w:r>
     </w:p>
     <w:p>
@@ -5787,7 +6117,24 @@
           <w:vertAlign w:val="baseline"/>
           <w:rtl w:val="0"/>
         </w:rPr>
-        <w:t>Tiempo de rodaje en número de días (indique el total de días de grabación del proyecto): {rodaje_dias}</w:t>
+        <w:t xml:space="preserve">Tiempo de rodaje en número de días (indique el total de días de grabación del proyecto): </w:t>
+      </w:r>
+      <w:r>
+        <w:rPr>
+          <w:rFonts w:ascii="Arial" w:cs="Arial" w:eastAsia="Arial" w:hAnsi="Arial"/>
+          <w:b w:val="0"/>
+          <w:i w:val="0"/>
+          <w:smallCaps w:val="0"/>
+          <w:strike w:val="0"/>
+          <w:color w:val="000000"/>
+          <w:sz w:val="24"/>
+          <w:szCs w:val="24"/>
+          <w:u w:val="single"/>
+          <w:shd w:fill="auto" w:val="clear"/>
+          <w:vertAlign w:val="baseline"/>
+          <w:rtl w:val="0"/>
+        </w:rPr>
+        <w:t>{rodaje_dias|57}</w:t>
       </w:r>
     </w:p>
     <w:p>
@@ -5853,7 +6200,24 @@
           <w:vertAlign w:val="baseline"/>
           <w:rtl w:val="0"/>
         </w:rPr>
-        <w:t>Fechas de filmación (indique de qué fecha a qué fecha se llevará a cabo la filmación del proyecto en la ciudad): {rodaje_fechas}</w:t>
+        <w:t xml:space="preserve">Fechas de filmación (indique de qué fecha a qué fecha se llevará a cabo la filmación del proyecto en la ciudad): </w:t>
+      </w:r>
+      <w:r>
+        <w:rPr>
+          <w:rFonts w:ascii="Arial" w:cs="Arial" w:eastAsia="Arial" w:hAnsi="Arial"/>
+          <w:b w:val="0"/>
+          <w:i w:val="0"/>
+          <w:smallCaps w:val="0"/>
+          <w:strike w:val="0"/>
+          <w:color w:val="000000"/>
+          <w:sz w:val="24"/>
+          <w:szCs w:val="24"/>
+          <w:u w:val="single"/>
+          <w:shd w:fill="auto" w:val="clear"/>
+          <w:vertAlign w:val="baseline"/>
+          <w:rtl w:val="0"/>
+        </w:rPr>
+        <w:t>{rodaje_fechas|36}</w:t>
       </w:r>
     </w:p>
     <w:p>
@@ -5985,7 +6349,15 @@
           <w:rFonts w:ascii="Arial" w:cs="Arial" w:eastAsia="Arial" w:hAnsi="Arial"/>
           <w:rtl w:val="0"/>
         </w:rPr>
-        <w:t>Fecha: {fecha}</w:t>
+        <w:t xml:space="preserve">Fecha: </w:t>
+      </w:r>
+      <w:r>
+        <w:rPr>
+          <w:rFonts w:ascii="Arial" w:cs="Arial" w:eastAsia="Arial" w:hAnsi="Arial"/>
+          <w:u w:val="single"/>
+          <w:rtl w:val="0"/>
+        </w:rPr>
+        <w:t>{fecha|64}</w:t>
       </w:r>
     </w:p>
     <w:p>
@@ -6015,7 +6387,14 @@
         </w:rPr>
         <w:t xml:space="preserve">Dirección de la locación (espacio público a usar): </w:t>
         <w:tab/>
-        <w:t>{direccion}</w:t>
+      </w:r>
+      <w:r>
+        <w:rPr>
+          <w:rFonts w:ascii="Arial" w:cs="Arial" w:eastAsia="Arial" w:hAnsi="Arial"/>
+          <w:u w:val="single"/>
+          <w:rtl w:val="0"/>
+        </w:rPr>
+        <w:t>{direccion|31}</w:t>
       </w:r>
     </w:p>
     <w:p>
@@ -6047,7 +6426,15 @@
         </w:rPr>
         <w:t>Indique si es Set de Filmación o Base de Producción:</w:t>
         <w:tab/>
-        <w:t xml:space="preserve"> {uso}</w:t>
+        <w:t xml:space="preserve"> </w:t>
+      </w:r>
+      <w:r>
+        <w:rPr>
+          <w:rFonts w:ascii="Arial" w:cs="Arial" w:eastAsia="Arial" w:hAnsi="Arial"/>
+          <w:u w:val="single"/>
+          <w:rtl w:val="0"/>
+        </w:rPr>
+        <w:t>{uso|28}</w:t>
       </w:r>
     </w:p>
     <w:p>
@@ -6189,7 +6576,7 @@
           <w:vertAlign w:val="baseline"/>
           <w:rtl w:val="0"/>
         </w:rPr>
-        <w:t>Filmación</w:t>
+        <w:t xml:space="preserve">Filmación</w:t>
       </w:r>
     </w:p>
     <w:p>
@@ -6245,7 +6632,7 @@
           <w:vertAlign w:val="baseline"/>
           <w:rtl w:val="0"/>
         </w:rPr>
-        <w:t>Desmontaje.</w:t>
+        <w:t xml:space="preserve">Desmontaje.</w:t>
       </w:r>
     </w:p>
     <w:p>
@@ -6275,7 +6662,20 @@
         </w:rPr>
         <w:t xml:space="preserve">Hora Inicial: </w:t>
         <w:tab/>
-        <w:t>{hora_inicio}</w:t>
+      </w:r>
+      <w:r>
+        <w:rPr>
+          <w:rFonts w:ascii="Arial" w:cs="Arial" w:eastAsia="Arial" w:hAnsi="Arial"/>
+          <w:u w:val="single"/>
+          <w:rtl w:val="0"/>
+        </w:rPr>
+        <w:t>{hora_inicio|60}</w:t>
+      </w:r>
+      <w:r>
+        <w:rPr>
+          <w:rFonts w:ascii="Arial" w:cs="Arial" w:eastAsia="Arial" w:hAnsi="Arial"/>
+          <w:rtl w:val="0"/>
+        </w:rPr>
         <w:tab/>
       </w:r>
     </w:p>
@@ -6293,7 +6693,15 @@
         </w:rPr>
         <w:t>Hora Final:</w:t>
         <w:br/>
-        <w:t xml:space="preserve"> {hora_fin}</w:t>
+        <w:t xml:space="preserve"> </w:t>
+      </w:r>
+      <w:r>
+        <w:rPr>
+          <w:rFonts w:ascii="Arial" w:cs="Arial" w:eastAsia="Arial" w:hAnsi="Arial"/>
+          <w:u w:val="single"/>
+          <w:rtl w:val="0"/>
+        </w:rPr>
+        <w:t>{hora_fin|61}</w:t>
       </w:r>
     </w:p>
     <w:p>
@@ -6468,7 +6876,15 @@
           <w:rFonts w:ascii="Arial" w:cs="Arial" w:eastAsia="Arial" w:hAnsi="Arial"/>
           <w:rtl w:val="0"/>
         </w:rPr>
-        <w:t>Correo electrónico autorizado: {notif_correo}</w:t>
+        <w:t xml:space="preserve">Correo electrónico autorizado: </w:t>
+      </w:r>
+      <w:r>
+        <w:rPr>
+          <w:rFonts w:ascii="Arial" w:cs="Arial" w:eastAsia="Arial" w:hAnsi="Arial"/>
+          <w:u w:val="single"/>
+          <w:rtl w:val="0"/>
+        </w:rPr>
+        <w:t>{notif_correo|40}</w:t>
       </w:r>
     </w:p>
     <w:p>
@@ -6595,9 +7011,10 @@
       <w:r>
         <w:rPr>
           <w:rFonts w:ascii="Arial" w:cs="Arial" w:eastAsia="Arial" w:hAnsi="Arial"/>
-          <w:rtl w:val="0"/>
-        </w:rPr>
-        <w:t>{firma}</w:t>
+          <w:u w:val="single"/>
+          <w:rtl w:val="0"/>
+        </w:rPr>
+        <w:t>{firma|22}</w:t>
       </w:r>
     </w:p>
     <w:p>

</xml_diff>